<commit_message>
Make landlord/tenant age optional instead of required over WhatsApp
Many customers never volunteer their age, and chasing it just for a
document detail isn't worth a WhatsApp round-trip. landlord_age and
tenant_age move to a new optional_fields category: still opportunistically
captured if the customer states it unprompted (extraction schema uses a
new extractable_fields_for() helper), but never asked about via follow-up
and never blocks approval. Editable on the review dashboard under a new
"Optional details" section.

Both rental agreement .docx templates now wrap the age clause in a
{% if %}/{% endif %} conditional so the phrase is omitted entirely from
the document when age is blank, rather than printing with a blank value.
Verified with test renders in both languages, with and without age.

Co-Authored-By: Claude Sonnet 5 <noreply@anthropic.com>
Claude-Session: https://claude.ai/code/session_01UsmiswDXojJNKfThx4Xowo
</commit_message>
<xml_diff>
--- a/templates_docx/rental_agreement_en.docx
+++ b/templates_docx/rental_agreement_en.docx
@@ -273,7 +273,7 @@
         <w:t>{{ landlord_name }}</w:t>
       </w:r>
       <w:r>
-        <w:t xml:space="preserve">, aged {{ landlord_age }} years, {{ landlord_parentage }} residing at {{ landlord_address }} (Hereinafter called the </w:t>
+        <w:t xml:space="preserve">, {% if landlord_age %}aged {{ landlord_age }} years, {% endif %}{{ landlord_parentage }} residing at {{ landlord_address }} (Hereinafter called the </w:t>
       </w:r>
       <w:r>
         <w:rPr>
@@ -318,7 +318,7 @@
         <w:t>{{ tenant_name }}</w:t>
       </w:r>
       <w:r>
-        <w:t>, aged {{ tenant_age }} years, {{ tenant_parentage }}, residing at {{ tenant_address }} (Hereinafter called the LICENSEE) of the Other Part.</w:t>
+        <w:t>, {% if tenant_age %}aged {{ tenant_age }} years, {% endif %}{{ tenant_parentage }}, residing at {{ tenant_address }} (Hereinafter called the LICENSEE) of the Other Part.</w:t>
       </w:r>
     </w:p>
     <w:p>

</xml_diff>